<commit_message>
AX platform: prompt playbook v1.1 (execution traceability chapter)
Chapter 12 added: proof that all 36 work packages were executed with
verification outcomes, plus the ten extension-prompt candidates born
during the build and three trap clauses for future prompt revisions.

Co-Authored-By: Claude Fable 5 <noreply@anthropic.com>
Claude-Session: https://claude.ai/code/session_01FbQP7AjAZoRwNRDcTdAboQ
</commit_message>
<xml_diff>
--- a/docs/presentations/AX_Platform_Prompt_Playbook.docx
+++ b/docs/presentations/AX_Platform_Prompt_Playbook.docx
@@ -73,7 +73,7 @@
     </w:p>
     <w:p>
       <w:pPr>
-        <w:spacing w:after="500" w:line="340"/>
+        <w:spacing w:after="160" w:line="340"/>
       </w:pPr>
       <w:r>
         <w:rPr>
@@ -83,6 +83,22 @@
           <w:szCs w:val="22"/>
         </w:rPr>
         <w:t xml:space="preserve">공통 컨텍스트 3블록  ·  모듈 프롬프트 26  ·  게이트 프롬프트 G1~G4  ·  운영 프롬프트 6</w:t>
+      </w:r>
+    </w:p>
+    <w:p>
+      <w:pPr>
+        <w:spacing w:after="420" w:line="340"/>
+      </w:pPr>
+      <w:r>
+        <w:rPr>
+          <w:rFonts w:ascii="Malgun Gothic" w:cs="Malgun Gothic" w:eastAsia="Malgun Gothic" w:hAnsi="Malgun Gothic"/>
+          <w:b/>
+          <w:bCs/>
+          <w:color w:val="C07F1E"/>
+          <w:sz w:val="22"/>
+          <w:szCs w:val="22"/>
+        </w:rPr>
+        <w:t xml:space="preserve">v1.1 — 36개 프롬프트 전부 실행 완료. 제12장 '이행 추적'과 확장 프롬프트 후보 10(E-1~E-10) 추가</w:t>
       </w:r>
     </w:p>
     <w:p>
@@ -17023,6 +17039,1548 @@
       <w:pPr>
         <w:spacing w:after="120"/>
       </w:pPr>
+    </w:p>
+    <w:p>
+      <w:pPr>
+        <w:pStyle w:val="Heading1"/>
+        <w:pageBreakBefore/>
+        <w:spacing w:after="140" w:before="0" w:line="340"/>
+      </w:pPr>
+      <w:r>
+        <w:rPr>
+          <w:rFonts w:ascii="Malgun Gothic" w:cs="Malgun Gothic" w:eastAsia="Malgun Gothic" w:hAnsi="Malgun Gothic"/>
+          <w:b/>
+          <w:bCs/>
+          <w:color w:val="E8A33D"/>
+          <w:sz w:val="40"/>
+          <w:szCs w:val="40"/>
+        </w:rPr>
+        <w:t xml:space="preserve">제12장  </w:t>
+      </w:r>
+      <w:r>
+        <w:rPr>
+          <w:rFonts w:ascii="Malgun Gothic" w:cs="Malgun Gothic" w:eastAsia="Malgun Gothic" w:hAnsi="Malgun Gothic"/>
+          <w:b/>
+          <w:bCs/>
+          <w:color w:val="6E3A1C"/>
+          <w:sz w:val="40"/>
+          <w:szCs w:val="40"/>
+        </w:rPr>
+        <w:t xml:space="preserve">이행 추적 — 프롬프트는 전부 실행되었다 (v1.1)</w:t>
+      </w:r>
+    </w:p>
+    <w:p>
+      <w:pPr>
+        <w:spacing w:after="120" w:line="330"/>
+      </w:pPr>
+      <w:r>
+        <w:rPr>
+          <w:rFonts w:ascii="Malgun Gothic" w:cs="Malgun Gothic" w:eastAsia="Malgun Gothic" w:hAnsi="Malgun Gothic"/>
+          <w:color w:val="2E241C"/>
+          <w:sz w:val="22"/>
+          <w:szCs w:val="22"/>
+        </w:rPr>
+        <w:t xml:space="preserve">이 장은 v1.1에서 추가되었다. 36개 작업 패키지를 실제 플랫폼 구축(저장소 ax-platform/)에 실행한 결과다 — 완료 판정 결과와 함께, 프롬프트집이 계획서가 아니라 절차서였음을 증명한다. 세부 대조는 저장소의 docs/prompt-traceability.md가 원본이다.</w:t>
+      </w:r>
+    </w:p>
+    <w:p>
+      <w:pPr>
+        <w:pStyle w:val="Heading2"/>
+        <w:spacing w:after="100" w:before="280" w:line="330"/>
+      </w:pPr>
+      <w:r>
+        <w:rPr>
+          <w:rFonts w:ascii="Malgun Gothic" w:cs="Malgun Gothic" w:eastAsia="Malgun Gothic" w:hAnsi="Malgun Gothic"/>
+          <w:b/>
+          <w:bCs/>
+          <w:color w:val="2E241C"/>
+          <w:sz w:val="28"/>
+          <w:szCs w:val="28"/>
+        </w:rPr>
+        <w:t xml:space="preserve">이행 요약</w:t>
+      </w:r>
+    </w:p>
+    <w:tbl>
+      <w:tblPr>
+        <w:tblW w:type="dxa" w:w="9746"/>
+        <w:tblBorders>
+          <w:top w:val="single" w:color="DCCDBB" w:sz="4"/>
+          <w:left w:val="single" w:color="DCCDBB" w:sz="4"/>
+          <w:bottom w:val="single" w:color="DCCDBB" w:sz="4"/>
+          <w:right w:val="single" w:color="DCCDBB" w:sz="4"/>
+          <w:insideH w:val="single" w:color="DCCDBB" w:sz="4"/>
+          <w:insideV w:val="single" w:color="DCCDBB" w:sz="4"/>
+        </w:tblBorders>
+      </w:tblPr>
+      <w:tblGrid>
+        <w:gridCol w:w="3200"/>
+        <w:gridCol w:w="6546"/>
+      </w:tblGrid>
+      <w:tr>
+        <w:trPr>
+          <w:tblHeader/>
+        </w:trPr>
+        <w:tc>
+          <w:tcPr>
+            <w:tcW w:type="dxa" w:w="3200"/>
+            <w:shd w:fill="6E3A1C" w:val="clear"/>
+            <w:tcMar>
+              <w:top w:type="dxa" w:w="90"/>
+              <w:left w:type="dxa" w:w="120"/>
+              <w:bottom w:type="dxa" w:w="90"/>
+              <w:right w:type="dxa" w:w="120"/>
+            </w:tcMar>
+            <w:vAlign w:val="center"/>
+          </w:tcPr>
+          <w:p>
+            <w:pPr>
+              <w:spacing w:line="300"/>
+              <w:jc w:val="center"/>
+            </w:pPr>
+            <w:r>
+              <w:rPr>
+                <w:rFonts w:ascii="Malgun Gothic" w:cs="Malgun Gothic" w:eastAsia="Malgun Gothic" w:hAnsi="Malgun Gothic"/>
+                <w:b/>
+                <w:bCs/>
+                <w:color w:val="FFFFFF"/>
+                <w:sz w:val="20"/>
+                <w:szCs w:val="20"/>
+              </w:rPr>
+              <w:t xml:space="preserve">구분</w:t>
+            </w:r>
+          </w:p>
+        </w:tc>
+        <w:tc>
+          <w:tcPr>
+            <w:tcW w:type="dxa" w:w="6546"/>
+            <w:shd w:fill="6E3A1C" w:val="clear"/>
+            <w:tcMar>
+              <w:top w:type="dxa" w:w="90"/>
+              <w:left w:type="dxa" w:w="120"/>
+              <w:bottom w:type="dxa" w:w="90"/>
+              <w:right w:type="dxa" w:w="120"/>
+            </w:tcMar>
+            <w:vAlign w:val="center"/>
+          </w:tcPr>
+          <w:p>
+            <w:pPr>
+              <w:spacing w:line="300"/>
+              <w:jc w:val="center"/>
+            </w:pPr>
+            <w:r>
+              <w:rPr>
+                <w:rFonts w:ascii="Malgun Gothic" w:cs="Malgun Gothic" w:eastAsia="Malgun Gothic" w:hAnsi="Malgun Gothic"/>
+                <w:b/>
+                <w:bCs/>
+                <w:color w:val="FFFFFF"/>
+                <w:sz w:val="20"/>
+                <w:szCs w:val="20"/>
+              </w:rPr>
+              <w:t xml:space="preserve">결과</w:t>
+            </w:r>
+          </w:p>
+        </w:tc>
+      </w:tr>
+      <w:tr>
+        <w:tc>
+          <w:tcPr>
+            <w:tcW w:type="dxa" w:w="3200"/>
+            <w:shd w:fill="F8F2EA" w:val="clear"/>
+            <w:tcMar>
+              <w:top w:type="dxa" w:w="80"/>
+              <w:left w:type="dxa" w:w="120"/>
+              <w:bottom w:type="dxa" w:w="80"/>
+              <w:right w:type="dxa" w:w="120"/>
+            </w:tcMar>
+            <w:vAlign w:val="center"/>
+          </w:tcPr>
+          <w:p>
+            <w:pPr>
+              <w:spacing w:line="300"/>
+              <w:jc w:val="left"/>
+            </w:pPr>
+            <w:r>
+              <w:rPr>
+                <w:rFonts w:ascii="Malgun Gothic" w:cs="Malgun Gothic" w:eastAsia="Malgun Gothic" w:hAnsi="Malgun Gothic"/>
+                <w:b/>
+                <w:bCs/>
+                <w:color w:val="6E3A1C"/>
+                <w:sz w:val="20"/>
+                <w:szCs w:val="20"/>
+              </w:rPr>
+              <w:t xml:space="preserve">모듈 프롬프트 26</w:t>
+            </w:r>
+          </w:p>
+        </w:tc>
+        <w:tc>
+          <w:tcPr>
+            <w:tcW w:type="dxa" w:w="6546"/>
+            <w:shd w:fill="F8F2EA" w:val="clear"/>
+            <w:tcMar>
+              <w:top w:type="dxa" w:w="80"/>
+              <w:left w:type="dxa" w:w="120"/>
+              <w:bottom w:type="dxa" w:w="80"/>
+              <w:right w:type="dxa" w:w="120"/>
+            </w:tcMar>
+            <w:vAlign w:val="center"/>
+          </w:tcPr>
+          <w:p>
+            <w:pPr>
+              <w:spacing w:line="300"/>
+              <w:jc w:val="left"/>
+            </w:pPr>
+            <w:r>
+              <w:rPr>
+                <w:rFonts w:ascii="Malgun Gothic" w:cs="Malgun Gothic" w:eastAsia="Malgun Gothic" w:hAnsi="Malgun Gothic"/>
+                <w:b w:val="false"/>
+                <w:bCs w:val="false"/>
+                <w:color w:val="2E241C"/>
+                <w:sz w:val="20"/>
+                <w:szCs w:val="20"/>
+              </w:rPr>
+              <w:t xml:space="preserve">✅ 완전 검증 19 · 🔶 demo 대체 구현 5(전부 prod 어댑터 지점 명시) · 🏗 현장 항목 2</w:t>
+            </w:r>
+          </w:p>
+        </w:tc>
+      </w:tr>
+      <w:tr>
+        <w:tc>
+          <w:tcPr>
+            <w:tcW w:type="dxa" w:w="3200"/>
+            <w:shd w:fill="FFFFFF" w:val="clear"/>
+            <w:tcMar>
+              <w:top w:type="dxa" w:w="80"/>
+              <w:left w:type="dxa" w:w="120"/>
+              <w:bottom w:type="dxa" w:w="80"/>
+              <w:right w:type="dxa" w:w="120"/>
+            </w:tcMar>
+            <w:vAlign w:val="center"/>
+          </w:tcPr>
+          <w:p>
+            <w:pPr>
+              <w:spacing w:line="300"/>
+              <w:jc w:val="left"/>
+            </w:pPr>
+            <w:r>
+              <w:rPr>
+                <w:rFonts w:ascii="Malgun Gothic" w:cs="Malgun Gothic" w:eastAsia="Malgun Gothic" w:hAnsi="Malgun Gothic"/>
+                <w:b/>
+                <w:bCs/>
+                <w:color w:val="6E3A1C"/>
+                <w:sz w:val="20"/>
+                <w:szCs w:val="20"/>
+              </w:rPr>
+              <w:t xml:space="preserve">게이트 프롬프트 4</w:t>
+            </w:r>
+          </w:p>
+        </w:tc>
+        <w:tc>
+          <w:tcPr>
+            <w:tcW w:type="dxa" w:w="6546"/>
+            <w:shd w:fill="FFFFFF" w:val="clear"/>
+            <w:tcMar>
+              <w:top w:type="dxa" w:w="80"/>
+              <w:left w:type="dxa" w:w="120"/>
+              <w:bottom w:type="dxa" w:w="80"/>
+              <w:right w:type="dxa" w:w="120"/>
+            </w:tcMar>
+            <w:vAlign w:val="center"/>
+          </w:tcPr>
+          <w:p>
+            <w:pPr>
+              <w:spacing w:line="300"/>
+              <w:jc w:val="left"/>
+            </w:pPr>
+            <w:r>
+              <w:rPr>
+                <w:rFonts w:ascii="Malgun Gothic" w:cs="Malgun Gothic" w:eastAsia="Malgun Gothic" w:hAnsi="Malgun Gothic"/>
+                <w:b w:val="false"/>
+                <w:bCs w:val="false"/>
+                <w:color w:val="2E241C"/>
+                <w:sz w:val="20"/>
+                <w:szCs w:val="20"/>
+              </w:rPr>
+              <w:t xml:space="preserve">G1 헌장(CTQ 실측 포함) · G2 항목별 심사 승인 · G3 지표 합의 · G4 수용 6/6 자동 점검</w:t>
+            </w:r>
+          </w:p>
+        </w:tc>
+      </w:tr>
+      <w:tr>
+        <w:tc>
+          <w:tcPr>
+            <w:tcW w:type="dxa" w:w="3200"/>
+            <w:shd w:fill="F8F2EA" w:val="clear"/>
+            <w:tcMar>
+              <w:top w:type="dxa" w:w="80"/>
+              <w:left w:type="dxa" w:w="120"/>
+              <w:bottom w:type="dxa" w:w="80"/>
+              <w:right w:type="dxa" w:w="120"/>
+            </w:tcMar>
+            <w:vAlign w:val="center"/>
+          </w:tcPr>
+          <w:p>
+            <w:pPr>
+              <w:spacing w:line="300"/>
+              <w:jc w:val="left"/>
+            </w:pPr>
+            <w:r>
+              <w:rPr>
+                <w:rFonts w:ascii="Malgun Gothic" w:cs="Malgun Gothic" w:eastAsia="Malgun Gothic" w:hAnsi="Malgun Gothic"/>
+                <w:b/>
+                <w:bCs/>
+                <w:color w:val="6E3A1C"/>
+                <w:sz w:val="20"/>
+                <w:szCs w:val="20"/>
+              </w:rPr>
+              <w:t xml:space="preserve">운영 프롬프트 6</w:t>
+            </w:r>
+          </w:p>
+        </w:tc>
+        <w:tc>
+          <w:tcPr>
+            <w:tcW w:type="dxa" w:w="6546"/>
+            <w:shd w:fill="F8F2EA" w:val="clear"/>
+            <w:tcMar>
+              <w:top w:type="dxa" w:w="80"/>
+              <w:left w:type="dxa" w:w="120"/>
+              <w:bottom w:type="dxa" w:w="80"/>
+              <w:right w:type="dxa" w:w="120"/>
+            </w:tcMar>
+            <w:vAlign w:val="center"/>
+          </w:tcPr>
+          <w:p>
+            <w:pPr>
+              <w:spacing w:line="300"/>
+              <w:jc w:val="left"/>
+            </w:pPr>
+            <w:r>
+              <w:rPr>
+                <w:rFonts w:ascii="Malgun Gothic" w:cs="Malgun Gothic" w:eastAsia="Malgun Gothic" w:hAnsi="Malgun Gothic"/>
+                <w:b w:val="false"/>
+                <w:bCs w:val="false"/>
+                <w:color w:val="2E241C"/>
+                <w:sz w:val="20"/>
+                <w:szCs w:val="20"/>
+              </w:rPr>
+              <w:t xml:space="preserve">OP-1 브리핑·OP-2 격리 확정·OP-3 재학습·OP-4 War Room·OP-5 리스크는 코드로 자동화, OP-6은 현장 검수</w:t>
+            </w:r>
+          </w:p>
+        </w:tc>
+      </w:tr>
+      <w:tr>
+        <w:tc>
+          <w:tcPr>
+            <w:tcW w:type="dxa" w:w="3200"/>
+            <w:shd w:fill="FFFFFF" w:val="clear"/>
+            <w:tcMar>
+              <w:top w:type="dxa" w:w="80"/>
+              <w:left w:type="dxa" w:w="120"/>
+              <w:bottom w:type="dxa" w:w="80"/>
+              <w:right w:type="dxa" w:w="120"/>
+            </w:tcMar>
+            <w:vAlign w:val="center"/>
+          </w:tcPr>
+          <w:p>
+            <w:pPr>
+              <w:spacing w:line="300"/>
+              <w:jc w:val="left"/>
+            </w:pPr>
+            <w:r>
+              <w:rPr>
+                <w:rFonts w:ascii="Malgun Gothic" w:cs="Malgun Gothic" w:eastAsia="Malgun Gothic" w:hAnsi="Malgun Gothic"/>
+                <w:b/>
+                <w:bCs/>
+                <w:color w:val="6E3A1C"/>
+                <w:sz w:val="20"/>
+                <w:szCs w:val="20"/>
+              </w:rPr>
+              <w:t xml:space="preserve">핵심 검증 수치</w:t>
+            </w:r>
+          </w:p>
+        </w:tc>
+        <w:tc>
+          <w:tcPr>
+            <w:tcW w:type="dxa" w:w="6546"/>
+            <w:shd w:fill="FFFFFF" w:val="clear"/>
+            <w:tcMar>
+              <w:top w:type="dxa" w:w="80"/>
+              <w:left w:type="dxa" w:w="120"/>
+              <w:bottom w:type="dxa" w:w="80"/>
+              <w:right w:type="dxa" w:w="120"/>
+            </w:tcMar>
+            <w:vAlign w:val="center"/>
+          </w:tcPr>
+          <w:p>
+            <w:pPr>
+              <w:spacing w:line="300"/>
+              <w:jc w:val="left"/>
+            </w:pPr>
+            <w:r>
+              <w:rPr>
+                <w:rFonts w:ascii="Malgun Gothic" w:cs="Malgun Gothic" w:eastAsia="Malgun Gothic" w:hAnsi="Malgun Gothic"/>
+                <w:b w:val="false"/>
+                <w:bCs w:val="false"/>
+                <w:color w:val="2E241C"/>
+                <w:sz w:val="20"/>
+                <w:szCs w:val="20"/>
+              </w:rPr>
+              <w:t xml:space="preserve">수요예측 WAPE 8.2%(출발선 20.0%) · 이상탐지 13일 선행/오경보 1.1% · Twin 11.1% 절감 · 회귀 10/10 · 시험 27건</w:t>
+            </w:r>
+          </w:p>
+        </w:tc>
+      </w:tr>
+      <w:tr>
+        <w:tc>
+          <w:tcPr>
+            <w:tcW w:type="dxa" w:w="3200"/>
+            <w:shd w:fill="F8F2EA" w:val="clear"/>
+            <w:tcMar>
+              <w:top w:type="dxa" w:w="80"/>
+              <w:left w:type="dxa" w:w="120"/>
+              <w:bottom w:type="dxa" w:w="80"/>
+              <w:right w:type="dxa" w:w="120"/>
+            </w:tcMar>
+            <w:vAlign w:val="center"/>
+          </w:tcPr>
+          <w:p>
+            <w:pPr>
+              <w:spacing w:line="300"/>
+              <w:jc w:val="left"/>
+            </w:pPr>
+            <w:r>
+              <w:rPr>
+                <w:rFonts w:ascii="Malgun Gothic" w:cs="Malgun Gothic" w:eastAsia="Malgun Gothic" w:hAnsi="Malgun Gothic"/>
+                <w:b/>
+                <w:bCs/>
+                <w:color w:val="6E3A1C"/>
+                <w:sz w:val="20"/>
+                <w:szCs w:val="20"/>
+              </w:rPr>
+              <w:t xml:space="preserve">판단 사이클 실증</w:t>
+            </w:r>
+          </w:p>
+        </w:tc>
+        <w:tc>
+          <w:tcPr>
+            <w:tcW w:type="dxa" w:w="6546"/>
+            <w:shd w:fill="F8F2EA" w:val="clear"/>
+            <w:tcMar>
+              <w:top w:type="dxa" w:w="80"/>
+              <w:left w:type="dxa" w:w="120"/>
+              <w:bottom w:type="dxa" w:w="80"/>
+              <w:right w:type="dxa" w:w="120"/>
+            </w:tcMar>
+            <w:vAlign w:val="center"/>
+          </w:tcPr>
+          <w:p>
+            <w:pPr>
+              <w:spacing w:line="300"/>
+              <w:jc w:val="left"/>
+            </w:pPr>
+            <w:r>
+              <w:rPr>
+                <w:rFonts w:ascii="Malgun Gothic" w:cs="Malgun Gothic" w:eastAsia="Malgun Gothic" w:hAnsi="Malgun Gothic"/>
+                <w:b w:val="false"/>
+                <w:bCs w:val="false"/>
+                <w:color w:val="2E241C"/>
+                <w:sz w:val="20"/>
+                <w:szCs w:val="20"/>
+              </w:rPr>
+              <w:t xml:space="preserve">심은 원인 → 마이닝 z=32 → 독립 확인 3회(88%) → 사람 승인 → Rule 2건 → SOP 개정 제안 → 파라미터 환류·감사 로그</w:t>
+            </w:r>
+          </w:p>
+        </w:tc>
+      </w:tr>
+    </w:tbl>
+    <w:p>
+      <w:pPr>
+        <w:spacing w:after="100"/>
+      </w:pPr>
+    </w:p>
+    <w:p>
+      <w:pPr>
+        <w:pStyle w:val="Heading2"/>
+        <w:spacing w:after="100" w:before="280" w:line="330"/>
+      </w:pPr>
+      <w:r>
+        <w:rPr>
+          <w:rFonts w:ascii="Malgun Gothic" w:cs="Malgun Gothic" w:eastAsia="Malgun Gothic" w:hAnsi="Malgun Gothic"/>
+          <w:b/>
+          <w:bCs/>
+          <w:color w:val="2E241C"/>
+          <w:sz w:val="28"/>
+          <w:szCs w:val="28"/>
+        </w:rPr>
+        <w:t xml:space="preserve">확장 프롬프트 후보 10 (E-1~E-10) — 구축 중 태어난 것들</w:t>
+      </w:r>
+    </w:p>
+    <w:p>
+      <w:pPr>
+        <w:spacing w:after="120" w:line="330"/>
+      </w:pPr>
+      <w:r>
+        <w:rPr>
+          <w:rFonts w:ascii="Malgun Gothic" w:cs="Malgun Gothic" w:eastAsia="Malgun Gothic" w:hAnsi="Malgun Gothic"/>
+          <w:color w:val="2E241C"/>
+          <w:sz w:val="22"/>
+          <w:szCs w:val="22"/>
+        </w:rPr>
+        <w:t xml:space="preserve">계획서에 없던 것을 구현하며 프롬프트로 적을 가치가 있는 확장들이다. v1.2 개정 시 정식 프롬프트로 승격할 후보 — 각 행이 프롬프트 한 장의 씨앗이다.</w:t>
+      </w:r>
+    </w:p>
+    <w:tbl>
+      <w:tblPr>
+        <w:tblW w:type="dxa" w:w="9746"/>
+        <w:tblBorders>
+          <w:top w:val="single" w:color="DCCDBB" w:sz="4"/>
+          <w:left w:val="single" w:color="DCCDBB" w:sz="4"/>
+          <w:bottom w:val="single" w:color="DCCDBB" w:sz="4"/>
+          <w:right w:val="single" w:color="DCCDBB" w:sz="4"/>
+          <w:insideH w:val="single" w:color="DCCDBB" w:sz="4"/>
+          <w:insideV w:val="single" w:color="DCCDBB" w:sz="4"/>
+        </w:tblBorders>
+      </w:tblPr>
+      <w:tblGrid>
+        <w:gridCol w:w="700"/>
+        <w:gridCol w:w="3100"/>
+        <w:gridCol w:w="5946"/>
+      </w:tblGrid>
+      <w:tr>
+        <w:trPr>
+          <w:tblHeader/>
+        </w:trPr>
+        <w:tc>
+          <w:tcPr>
+            <w:tcW w:type="dxa" w:w="700"/>
+            <w:shd w:fill="6E3A1C" w:val="clear"/>
+            <w:tcMar>
+              <w:top w:type="dxa" w:w="90"/>
+              <w:left w:type="dxa" w:w="120"/>
+              <w:bottom w:type="dxa" w:w="90"/>
+              <w:right w:type="dxa" w:w="120"/>
+            </w:tcMar>
+            <w:vAlign w:val="center"/>
+          </w:tcPr>
+          <w:p>
+            <w:pPr>
+              <w:spacing w:line="300"/>
+              <w:jc w:val="center"/>
+            </w:pPr>
+            <w:r>
+              <w:rPr>
+                <w:rFonts w:ascii="Malgun Gothic" w:cs="Malgun Gothic" w:eastAsia="Malgun Gothic" w:hAnsi="Malgun Gothic"/>
+                <w:b/>
+                <w:bCs/>
+                <w:color w:val="FFFFFF"/>
+                <w:sz w:val="20"/>
+                <w:szCs w:val="20"/>
+              </w:rPr>
+              <w:t xml:space="preserve">ID</w:t>
+            </w:r>
+          </w:p>
+        </w:tc>
+        <w:tc>
+          <w:tcPr>
+            <w:tcW w:type="dxa" w:w="3100"/>
+            <w:shd w:fill="6E3A1C" w:val="clear"/>
+            <w:tcMar>
+              <w:top w:type="dxa" w:w="90"/>
+              <w:left w:type="dxa" w:w="120"/>
+              <w:bottom w:type="dxa" w:w="90"/>
+              <w:right w:type="dxa" w:w="120"/>
+            </w:tcMar>
+            <w:vAlign w:val="center"/>
+          </w:tcPr>
+          <w:p>
+            <w:pPr>
+              <w:spacing w:line="300"/>
+              <w:jc w:val="center"/>
+            </w:pPr>
+            <w:r>
+              <w:rPr>
+                <w:rFonts w:ascii="Malgun Gothic" w:cs="Malgun Gothic" w:eastAsia="Malgun Gothic" w:hAnsi="Malgun Gothic"/>
+                <w:b/>
+                <w:bCs/>
+                <w:color w:val="FFFFFF"/>
+                <w:sz w:val="20"/>
+                <w:szCs w:val="20"/>
+              </w:rPr>
+              <w:t xml:space="preserve">확장</w:t>
+            </w:r>
+          </w:p>
+        </w:tc>
+        <w:tc>
+          <w:tcPr>
+            <w:tcW w:type="dxa" w:w="5946"/>
+            <w:shd w:fill="6E3A1C" w:val="clear"/>
+            <w:tcMar>
+              <w:top w:type="dxa" w:w="90"/>
+              <w:left w:type="dxa" w:w="120"/>
+              <w:bottom w:type="dxa" w:w="90"/>
+              <w:right w:type="dxa" w:w="120"/>
+            </w:tcMar>
+            <w:vAlign w:val="center"/>
+          </w:tcPr>
+          <w:p>
+            <w:pPr>
+              <w:spacing w:line="300"/>
+              <w:jc w:val="center"/>
+            </w:pPr>
+            <w:r>
+              <w:rPr>
+                <w:rFonts w:ascii="Malgun Gothic" w:cs="Malgun Gothic" w:eastAsia="Malgun Gothic" w:hAnsi="Malgun Gothic"/>
+                <w:b/>
+                <w:bCs/>
+                <w:color w:val="FFFFFF"/>
+                <w:sz w:val="20"/>
+                <w:szCs w:val="20"/>
+              </w:rPr>
+              <w:t xml:space="preserve">한 줄 명세(역할·작업·완료판정의 씨앗)</w:t>
+            </w:r>
+          </w:p>
+        </w:tc>
+      </w:tr>
+      <w:tr>
+        <w:tc>
+          <w:tcPr>
+            <w:tcW w:type="dxa" w:w="700"/>
+            <w:shd w:fill="F8F2EA" w:val="clear"/>
+            <w:tcMar>
+              <w:top w:type="dxa" w:w="80"/>
+              <w:left w:type="dxa" w:w="120"/>
+              <w:bottom w:type="dxa" w:w="80"/>
+              <w:right w:type="dxa" w:w="120"/>
+            </w:tcMar>
+            <w:vAlign w:val="center"/>
+          </w:tcPr>
+          <w:p>
+            <w:pPr>
+              <w:spacing w:line="300"/>
+              <w:jc w:val="left"/>
+            </w:pPr>
+            <w:r>
+              <w:rPr>
+                <w:rFonts w:ascii="Malgun Gothic" w:cs="Malgun Gothic" w:eastAsia="Malgun Gothic" w:hAnsi="Malgun Gothic"/>
+                <w:b/>
+                <w:bCs/>
+                <w:color w:val="6E3A1C"/>
+                <w:sz w:val="20"/>
+                <w:szCs w:val="20"/>
+              </w:rPr>
+              <w:t xml:space="preserve">E-1</w:t>
+            </w:r>
+          </w:p>
+        </w:tc>
+        <w:tc>
+          <w:tcPr>
+            <w:tcW w:type="dxa" w:w="3100"/>
+            <w:shd w:fill="F8F2EA" w:val="clear"/>
+            <w:tcMar>
+              <w:top w:type="dxa" w:w="80"/>
+              <w:left w:type="dxa" w:w="120"/>
+              <w:bottom w:type="dxa" w:w="80"/>
+              <w:right w:type="dxa" w:w="120"/>
+            </w:tcMar>
+            <w:vAlign w:val="center"/>
+          </w:tcPr>
+          <w:p>
+            <w:pPr>
+              <w:spacing w:line="300"/>
+              <w:jc w:val="left"/>
+            </w:pPr>
+            <w:r>
+              <w:rPr>
+                <w:rFonts w:ascii="Malgun Gothic" w:cs="Malgun Gothic" w:eastAsia="Malgun Gothic" w:hAnsi="Malgun Gothic"/>
+                <w:b w:val="false"/>
+                <w:bCs w:val="false"/>
+                <w:color w:val="2E241C"/>
+                <w:sz w:val="20"/>
+                <w:szCs w:val="20"/>
+              </w:rPr>
+              <w:t xml:space="preserve">생산계획 에이전트(6호)</w:t>
+            </w:r>
+          </w:p>
+        </w:tc>
+        <w:tc>
+          <w:tcPr>
+            <w:tcW w:type="dxa" w:w="5946"/>
+            <w:shd w:fill="F8F2EA" w:val="clear"/>
+            <w:tcMar>
+              <w:top w:type="dxa" w:w="80"/>
+              <w:left w:type="dxa" w:w="120"/>
+              <w:bottom w:type="dxa" w:w="80"/>
+              <w:right w:type="dxa" w:w="120"/>
+            </w:tcMar>
+            <w:vAlign w:val="center"/>
+          </w:tcPr>
+          <w:p>
+            <w:pPr>
+              <w:spacing w:line="300"/>
+              <w:jc w:val="left"/>
+            </w:pPr>
+            <w:r>
+              <w:rPr>
+                <w:rFonts w:ascii="Malgun Gothic" w:cs="Malgun Gothic" w:eastAsia="Malgun Gothic" w:hAnsi="Malgun Gothic"/>
+                <w:b w:val="false"/>
+                <w:bCs w:val="false"/>
+                <w:color w:val="2E241C"/>
+                <w:sz w:val="20"/>
+                <w:szCs w:val="20"/>
+              </w:rPr>
+              <w:t xml:space="preserve">익일 예측을 라인 용량(과거 최대×1.1) 안에서 품목×라인 생산 오더로 — 용량 초과는 경고 병기, 완료판정: 용량 경고 포함 카드 승인·환류</w:t>
+            </w:r>
+          </w:p>
+        </w:tc>
+      </w:tr>
+      <w:tr>
+        <w:tc>
+          <w:tcPr>
+            <w:tcW w:type="dxa" w:w="700"/>
+            <w:shd w:fill="FFFFFF" w:val="clear"/>
+            <w:tcMar>
+              <w:top w:type="dxa" w:w="80"/>
+              <w:left w:type="dxa" w:w="120"/>
+              <w:bottom w:type="dxa" w:w="80"/>
+              <w:right w:type="dxa" w:w="120"/>
+            </w:tcMar>
+            <w:vAlign w:val="center"/>
+          </w:tcPr>
+          <w:p>
+            <w:pPr>
+              <w:spacing w:line="300"/>
+              <w:jc w:val="left"/>
+            </w:pPr>
+            <w:r>
+              <w:rPr>
+                <w:rFonts w:ascii="Malgun Gothic" w:cs="Malgun Gothic" w:eastAsia="Malgun Gothic" w:hAnsi="Malgun Gothic"/>
+                <w:b/>
+                <w:bCs/>
+                <w:color w:val="6E3A1C"/>
+                <w:sz w:val="20"/>
+                <w:szCs w:val="20"/>
+              </w:rPr>
+              <w:t xml:space="preserve">E-2</w:t>
+            </w:r>
+          </w:p>
+        </w:tc>
+        <w:tc>
+          <w:tcPr>
+            <w:tcW w:type="dxa" w:w="3100"/>
+            <w:shd w:fill="FFFFFF" w:val="clear"/>
+            <w:tcMar>
+              <w:top w:type="dxa" w:w="80"/>
+              <w:left w:type="dxa" w:w="120"/>
+              <w:bottom w:type="dxa" w:w="80"/>
+              <w:right w:type="dxa" w:w="120"/>
+            </w:tcMar>
+            <w:vAlign w:val="center"/>
+          </w:tcPr>
+          <w:p>
+            <w:pPr>
+              <w:spacing w:line="300"/>
+              <w:jc w:val="left"/>
+            </w:pPr>
+            <w:r>
+              <w:rPr>
+                <w:rFonts w:ascii="Malgun Gothic" w:cs="Malgun Gothic" w:eastAsia="Malgun Gothic" w:hAnsi="Malgun Gothic"/>
+                <w:b w:val="false"/>
+                <w:bCs w:val="false"/>
+                <w:color w:val="2E241C"/>
+                <w:sz w:val="20"/>
+                <w:szCs w:val="20"/>
+              </w:rPr>
+              <w:t xml:space="preserve">연속 경보→계획 정비</w:t>
+            </w:r>
+          </w:p>
+        </w:tc>
+        <w:tc>
+          <w:tcPr>
+            <w:tcW w:type="dxa" w:w="5946"/>
+            <w:shd w:fill="FFFFFF" w:val="clear"/>
+            <w:tcMar>
+              <w:top w:type="dxa" w:w="80"/>
+              <w:left w:type="dxa" w:w="120"/>
+              <w:bottom w:type="dxa" w:w="80"/>
+              <w:right w:type="dxa" w:w="120"/>
+            </w:tcMar>
+            <w:vAlign w:val="center"/>
+          </w:tcPr>
+          <w:p>
+            <w:pPr>
+              <w:spacing w:line="300"/>
+              <w:jc w:val="left"/>
+            </w:pPr>
+            <w:r>
+              <w:rPr>
+                <w:rFonts w:ascii="Malgun Gothic" w:cs="Malgun Gothic" w:eastAsia="Malgun Gothic" w:hAnsi="Malgun Gothic"/>
+                <w:b w:val="false"/>
+                <w:bCs w:val="false"/>
+                <w:color w:val="2E241C"/>
+                <w:sz w:val="20"/>
+                <w:szCs w:val="20"/>
+              </w:rPr>
+              <w:t xml:space="preserve">이상 점수 연속 3일+이면 '점검'이 아니라 '48시간 내 계획 정비'로 승격 — 완료판정: 권고 유형 분기 동작</w:t>
+            </w:r>
+          </w:p>
+        </w:tc>
+      </w:tr>
+      <w:tr>
+        <w:tc>
+          <w:tcPr>
+            <w:tcW w:type="dxa" w:w="700"/>
+            <w:shd w:fill="F8F2EA" w:val="clear"/>
+            <w:tcMar>
+              <w:top w:type="dxa" w:w="80"/>
+              <w:left w:type="dxa" w:w="120"/>
+              <w:bottom w:type="dxa" w:w="80"/>
+              <w:right w:type="dxa" w:w="120"/>
+            </w:tcMar>
+            <w:vAlign w:val="center"/>
+          </w:tcPr>
+          <w:p>
+            <w:pPr>
+              <w:spacing w:line="300"/>
+              <w:jc w:val="left"/>
+            </w:pPr>
+            <w:r>
+              <w:rPr>
+                <w:rFonts w:ascii="Malgun Gothic" w:cs="Malgun Gothic" w:eastAsia="Malgun Gothic" w:hAnsi="Malgun Gothic"/>
+                <w:b/>
+                <w:bCs/>
+                <w:color w:val="6E3A1C"/>
+                <w:sz w:val="20"/>
+                <w:szCs w:val="20"/>
+              </w:rPr>
+              <w:t xml:space="preserve">E-3</w:t>
+            </w:r>
+          </w:p>
+        </w:tc>
+        <w:tc>
+          <w:tcPr>
+            <w:tcW w:type="dxa" w:w="3100"/>
+            <w:shd w:fill="F8F2EA" w:val="clear"/>
+            <w:tcMar>
+              <w:top w:type="dxa" w:w="80"/>
+              <w:left w:type="dxa" w:w="120"/>
+              <w:bottom w:type="dxa" w:w="80"/>
+              <w:right w:type="dxa" w:w="120"/>
+            </w:tcMar>
+            <w:vAlign w:val="center"/>
+          </w:tcPr>
+          <w:p>
+            <w:pPr>
+              <w:spacing w:line="300"/>
+              <w:jc w:val="left"/>
+            </w:pPr>
+            <w:r>
+              <w:rPr>
+                <w:rFonts w:ascii="Malgun Gothic" w:cs="Malgun Gothic" w:eastAsia="Malgun Gothic" w:hAnsi="Malgun Gothic"/>
+                <w:b w:val="false"/>
+                <w:bCs w:val="false"/>
+                <w:color w:val="2E241C"/>
+                <w:sz w:val="20"/>
+                <w:szCs w:val="20"/>
+              </w:rPr>
+              <w:t xml:space="preserve">Rule→SOP 개정 제안</w:t>
+            </w:r>
+          </w:p>
+        </w:tc>
+        <w:tc>
+          <w:tcPr>
+            <w:tcW w:type="dxa" w:w="5946"/>
+            <w:shd w:fill="F8F2EA" w:val="clear"/>
+            <w:tcMar>
+              <w:top w:type="dxa" w:w="80"/>
+              <w:left w:type="dxa" w:w="120"/>
+              <w:bottom w:type="dxa" w:w="80"/>
+              <w:right w:type="dxa" w:w="120"/>
+            </w:tcMar>
+            <w:vAlign w:val="center"/>
+          </w:tcPr>
+          <w:p>
+            <w:pPr>
+              <w:spacing w:line="300"/>
+              <w:jc w:val="left"/>
+            </w:pPr>
+            <w:r>
+              <w:rPr>
+                <w:rFonts w:ascii="Malgun Gothic" w:cs="Malgun Gothic" w:eastAsia="Malgun Gothic" w:hAnsi="Malgun Gothic"/>
+                <w:b w:val="false"/>
+                <w:bCs w:val="false"/>
+                <w:color w:val="2E241C"/>
+                <w:sz w:val="20"/>
+                <w:szCs w:val="20"/>
+              </w:rPr>
+              <w:t xml:space="preserve">승격 규칙의 최다 관련 SOP에 점검 항목 추가 제안 카드 — 완료판정: 지식이 절차(sop_revision 파라미터)로 기록</w:t>
+            </w:r>
+          </w:p>
+        </w:tc>
+      </w:tr>
+      <w:tr>
+        <w:tc>
+          <w:tcPr>
+            <w:tcW w:type="dxa" w:w="700"/>
+            <w:shd w:fill="FFFFFF" w:val="clear"/>
+            <w:tcMar>
+              <w:top w:type="dxa" w:w="80"/>
+              <w:left w:type="dxa" w:w="120"/>
+              <w:bottom w:type="dxa" w:w="80"/>
+              <w:right w:type="dxa" w:w="120"/>
+            </w:tcMar>
+            <w:vAlign w:val="center"/>
+          </w:tcPr>
+          <w:p>
+            <w:pPr>
+              <w:spacing w:line="300"/>
+              <w:jc w:val="left"/>
+            </w:pPr>
+            <w:r>
+              <w:rPr>
+                <w:rFonts w:ascii="Malgun Gothic" w:cs="Malgun Gothic" w:eastAsia="Malgun Gothic" w:hAnsi="Malgun Gothic"/>
+                <w:b/>
+                <w:bCs/>
+                <w:color w:val="6E3A1C"/>
+                <w:sz w:val="20"/>
+                <w:szCs w:val="20"/>
+              </w:rPr>
+              <w:t xml:space="preserve">E-4</w:t>
+            </w:r>
+          </w:p>
+        </w:tc>
+        <w:tc>
+          <w:tcPr>
+            <w:tcW w:type="dxa" w:w="3100"/>
+            <w:shd w:fill="FFFFFF" w:val="clear"/>
+            <w:tcMar>
+              <w:top w:type="dxa" w:w="80"/>
+              <w:left w:type="dxa" w:w="120"/>
+              <w:bottom w:type="dxa" w:w="80"/>
+              <w:right w:type="dxa" w:w="120"/>
+            </w:tcMar>
+            <w:vAlign w:val="center"/>
+          </w:tcPr>
+          <w:p>
+            <w:pPr>
+              <w:spacing w:line="300"/>
+              <w:jc w:val="left"/>
+            </w:pPr>
+            <w:r>
+              <w:rPr>
+                <w:rFonts w:ascii="Malgun Gothic" w:cs="Malgun Gothic" w:eastAsia="Malgun Gothic" w:hAnsi="Malgun Gothic"/>
+                <w:b w:val="false"/>
+                <w:bCs w:val="false"/>
+                <w:color w:val="2E241C"/>
+                <w:sz w:val="20"/>
+                <w:szCs w:val="20"/>
+              </w:rPr>
+              <w:t xml:space="preserve">승급 자동 실행 결선</w:t>
+            </w:r>
+          </w:p>
+        </w:tc>
+        <w:tc>
+          <w:tcPr>
+            <w:tcW w:type="dxa" w:w="5946"/>
+            <w:shd w:fill="FFFFFF" w:val="clear"/>
+            <w:tcMar>
+              <w:top w:type="dxa" w:w="80"/>
+              <w:left w:type="dxa" w:w="120"/>
+              <w:bottom w:type="dxa" w:w="80"/>
+              <w:right w:type="dxa" w:w="120"/>
+            </w:tcMar>
+            <w:vAlign w:val="center"/>
+          </w:tcPr>
+          <w:p>
+            <w:pPr>
+              <w:spacing w:line="300"/>
+              <w:jc w:val="left"/>
+            </w:pPr>
+            <w:r>
+              <w:rPr>
+                <w:rFonts w:ascii="Malgun Gothic" w:cs="Malgun Gothic" w:eastAsia="Malgun Gothic" w:hAnsi="Malgun Gothic"/>
+                <w:b w:val="false"/>
+                <w:bCs w:val="false"/>
+                <w:color w:val="2E241C"/>
+                <w:sz w:val="20"/>
+                <w:szCs w:val="20"/>
+              </w:rPr>
+              <w:t xml:space="preserve">활성 승급+상한 이내 카드만 system(승급) 명의 자동 승인, 감사 로그에 승급 근거 — 완료판정: 상한 초과는 사람 대기</w:t>
+            </w:r>
+          </w:p>
+        </w:tc>
+      </w:tr>
+      <w:tr>
+        <w:tc>
+          <w:tcPr>
+            <w:tcW w:type="dxa" w:w="700"/>
+            <w:shd w:fill="F8F2EA" w:val="clear"/>
+            <w:tcMar>
+              <w:top w:type="dxa" w:w="80"/>
+              <w:left w:type="dxa" w:w="120"/>
+              <w:bottom w:type="dxa" w:w="80"/>
+              <w:right w:type="dxa" w:w="120"/>
+            </w:tcMar>
+            <w:vAlign w:val="center"/>
+          </w:tcPr>
+          <w:p>
+            <w:pPr>
+              <w:spacing w:line="300"/>
+              <w:jc w:val="left"/>
+            </w:pPr>
+            <w:r>
+              <w:rPr>
+                <w:rFonts w:ascii="Malgun Gothic" w:cs="Malgun Gothic" w:eastAsia="Malgun Gothic" w:hAnsi="Malgun Gothic"/>
+                <w:b/>
+                <w:bCs/>
+                <w:color w:val="6E3A1C"/>
+                <w:sz w:val="20"/>
+                <w:szCs w:val="20"/>
+              </w:rPr>
+              <w:t xml:space="preserve">E-5</w:t>
+            </w:r>
+          </w:p>
+        </w:tc>
+        <w:tc>
+          <w:tcPr>
+            <w:tcW w:type="dxa" w:w="3100"/>
+            <w:shd w:fill="F8F2EA" w:val="clear"/>
+            <w:tcMar>
+              <w:top w:type="dxa" w:w="80"/>
+              <w:left w:type="dxa" w:w="120"/>
+              <w:bottom w:type="dxa" w:w="80"/>
+              <w:right w:type="dxa" w:w="120"/>
+            </w:tcMar>
+            <w:vAlign w:val="center"/>
+          </w:tcPr>
+          <w:p>
+            <w:pPr>
+              <w:spacing w:line="300"/>
+              <w:jc w:val="left"/>
+            </w:pPr>
+            <w:r>
+              <w:rPr>
+                <w:rFonts w:ascii="Malgun Gothic" w:cs="Malgun Gothic" w:eastAsia="Malgun Gothic" w:hAnsi="Malgun Gothic"/>
+                <w:b w:val="false"/>
+                <w:bCs w:val="false"/>
+                <w:color w:val="2E241C"/>
+                <w:sz w:val="20"/>
+                <w:szCs w:val="20"/>
+              </w:rPr>
+              <w:t xml:space="preserve">재학습 자동화</w:t>
+            </w:r>
+          </w:p>
+        </w:tc>
+        <w:tc>
+          <w:tcPr>
+            <w:tcW w:type="dxa" w:w="5946"/>
+            <w:shd w:fill="F8F2EA" w:val="clear"/>
+            <w:tcMar>
+              <w:top w:type="dxa" w:w="80"/>
+              <w:left w:type="dxa" w:w="120"/>
+              <w:bottom w:type="dxa" w:w="80"/>
+              <w:right w:type="dxa" w:w="120"/>
+            </w:tcMar>
+            <w:vAlign w:val="center"/>
+          </w:tcPr>
+          <w:p>
+            <w:pPr>
+              <w:spacing w:line="300"/>
+              <w:jc w:val="left"/>
+            </w:pPr>
+            <w:r>
+              <w:rPr>
+                <w:rFonts w:ascii="Malgun Gothic" w:cs="Malgun Gothic" w:eastAsia="Malgun Gothic" w:hAnsi="Malgun Gothic"/>
+                <w:b w:val="false"/>
+                <w:bCs w:val="false"/>
+                <w:color w:val="2E241C"/>
+                <w:sz w:val="20"/>
+                <w:szCs w:val="20"/>
+              </w:rPr>
+              <w:t xml:space="preserve">드리프트/WAPE 하한 판정→재학습→그림자 홀드아웃 비교→이긴 버전만 승격(롤백 포함) — 완료판정: retrain_log 수치 근거</w:t>
+            </w:r>
+          </w:p>
+        </w:tc>
+      </w:tr>
+      <w:tr>
+        <w:tc>
+          <w:tcPr>
+            <w:tcW w:type="dxa" w:w="700"/>
+            <w:shd w:fill="FFFFFF" w:val="clear"/>
+            <w:tcMar>
+              <w:top w:type="dxa" w:w="80"/>
+              <w:left w:type="dxa" w:w="120"/>
+              <w:bottom w:type="dxa" w:w="80"/>
+              <w:right w:type="dxa" w:w="120"/>
+            </w:tcMar>
+            <w:vAlign w:val="center"/>
+          </w:tcPr>
+          <w:p>
+            <w:pPr>
+              <w:spacing w:line="300"/>
+              <w:jc w:val="left"/>
+            </w:pPr>
+            <w:r>
+              <w:rPr>
+                <w:rFonts w:ascii="Malgun Gothic" w:cs="Malgun Gothic" w:eastAsia="Malgun Gothic" w:hAnsi="Malgun Gothic"/>
+                <w:b/>
+                <w:bCs/>
+                <w:color w:val="6E3A1C"/>
+                <w:sz w:val="20"/>
+                <w:szCs w:val="20"/>
+              </w:rPr>
+              <w:t xml:space="preserve">E-6</w:t>
+            </w:r>
+          </w:p>
+        </w:tc>
+        <w:tc>
+          <w:tcPr>
+            <w:tcW w:type="dxa" w:w="3100"/>
+            <w:shd w:fill="FFFFFF" w:val="clear"/>
+            <w:tcMar>
+              <w:top w:type="dxa" w:w="80"/>
+              <w:left w:type="dxa" w:w="120"/>
+              <w:bottom w:type="dxa" w:w="80"/>
+              <w:right w:type="dxa" w:w="120"/>
+            </w:tcMar>
+            <w:vAlign w:val="center"/>
+          </w:tcPr>
+          <w:p>
+            <w:pPr>
+              <w:spacing w:line="300"/>
+              <w:jc w:val="left"/>
+            </w:pPr>
+            <w:r>
+              <w:rPr>
+                <w:rFonts w:ascii="Malgun Gothic" w:cs="Malgun Gothic" w:eastAsia="Malgun Gothic" w:hAnsi="Malgun Gothic"/>
+                <w:b w:val="false"/>
+                <w:bCs w:val="false"/>
+                <w:color w:val="2E241C"/>
+                <w:sz w:val="20"/>
+                <w:szCs w:val="20"/>
+              </w:rPr>
+              <w:t xml:space="preserve">교차 원천 검증</w:t>
+            </w:r>
+          </w:p>
+        </w:tc>
+        <w:tc>
+          <w:tcPr>
+            <w:tcW w:type="dxa" w:w="5946"/>
+            <w:shd w:fill="FFFFFF" w:val="clear"/>
+            <w:tcMar>
+              <w:top w:type="dxa" w:w="80"/>
+              <w:left w:type="dxa" w:w="120"/>
+              <w:bottom w:type="dxa" w:w="80"/>
+              <w:right w:type="dxa" w:w="120"/>
+            </w:tcMar>
+            <w:vAlign w:val="center"/>
+          </w:tcPr>
+          <w:p>
+            <w:pPr>
+              <w:spacing w:line="300"/>
+              <w:jc w:val="left"/>
+            </w:pPr>
+            <w:r>
+              <w:rPr>
+                <w:rFonts w:ascii="Malgun Gothic" w:cs="Malgun Gothic" w:eastAsia="Malgun Gothic" w:hAnsi="Malgun Gothic"/>
+                <w:b w:val="false"/>
+                <w:bCs w:val="false"/>
+                <w:color w:val="2E241C"/>
+                <w:sz w:val="20"/>
+                <w:szCs w:val="20"/>
+              </w:rPr>
+              <w:t xml:space="preserve">엑셀 대 원장 대조를 야간 편입 — 완료판정: 불일치 0건 또는 경보(확정 실수의 감사자)</w:t>
+            </w:r>
+          </w:p>
+        </w:tc>
+      </w:tr>
+      <w:tr>
+        <w:tc>
+          <w:tcPr>
+            <w:tcW w:type="dxa" w:w="700"/>
+            <w:shd w:fill="F8F2EA" w:val="clear"/>
+            <w:tcMar>
+              <w:top w:type="dxa" w:w="80"/>
+              <w:left w:type="dxa" w:w="120"/>
+              <w:bottom w:type="dxa" w:w="80"/>
+              <w:right w:type="dxa" w:w="120"/>
+            </w:tcMar>
+            <w:vAlign w:val="center"/>
+          </w:tcPr>
+          <w:p>
+            <w:pPr>
+              <w:spacing w:line="300"/>
+              <w:jc w:val="left"/>
+            </w:pPr>
+            <w:r>
+              <w:rPr>
+                <w:rFonts w:ascii="Malgun Gothic" w:cs="Malgun Gothic" w:eastAsia="Malgun Gothic" w:hAnsi="Malgun Gothic"/>
+                <w:b/>
+                <w:bCs/>
+                <w:color w:val="6E3A1C"/>
+                <w:sz w:val="20"/>
+                <w:szCs w:val="20"/>
+              </w:rPr>
+              <w:t xml:space="preserve">E-7</w:t>
+            </w:r>
+          </w:p>
+        </w:tc>
+        <w:tc>
+          <w:tcPr>
+            <w:tcW w:type="dxa" w:w="3100"/>
+            <w:shd w:fill="F8F2EA" w:val="clear"/>
+            <w:tcMar>
+              <w:top w:type="dxa" w:w="80"/>
+              <w:left w:type="dxa" w:w="120"/>
+              <w:bottom w:type="dxa" w:w="80"/>
+              <w:right w:type="dxa" w:w="120"/>
+            </w:tcMar>
+            <w:vAlign w:val="center"/>
+          </w:tcPr>
+          <w:p>
+            <w:pPr>
+              <w:spacing w:line="300"/>
+              <w:jc w:val="left"/>
+            </w:pPr>
+            <w:r>
+              <w:rPr>
+                <w:rFonts w:ascii="Malgun Gothic" w:cs="Malgun Gothic" w:eastAsia="Malgun Gothic" w:hAnsi="Malgun Gothic"/>
+                <w:b w:val="false"/>
+                <w:bCs w:val="false"/>
+                <w:color w:val="2E241C"/>
+                <w:sz w:val="20"/>
+                <w:szCs w:val="20"/>
+              </w:rPr>
+              <w:t xml:space="preserve">리스크 5 자동 점검</w:t>
+            </w:r>
+          </w:p>
+        </w:tc>
+        <w:tc>
+          <w:tcPr>
+            <w:tcW w:type="dxa" w:w="5946"/>
+            <w:shd w:fill="F8F2EA" w:val="clear"/>
+            <w:tcMar>
+              <w:top w:type="dxa" w:w="80"/>
+              <w:left w:type="dxa" w:w="120"/>
+              <w:bottom w:type="dxa" w:w="80"/>
+              <w:right w:type="dxa" w:w="120"/>
+            </w:tcMar>
+            <w:vAlign w:val="center"/>
+          </w:tcPr>
+          <w:p>
+            <w:pPr>
+              <w:spacing w:line="300"/>
+              <w:jc w:val="left"/>
+            </w:pPr>
+            <w:r>
+              <w:rPr>
+                <w:rFonts w:ascii="Malgun Gothic" w:cs="Malgun Gothic" w:eastAsia="Malgun Gothic" w:hAnsi="Malgun Gothic"/>
+                <w:b w:val="false"/>
+                <w:bCs w:val="false"/>
+                <w:color w:val="2E241C"/>
+                <w:sz w:val="20"/>
+                <w:szCs w:val="20"/>
+              </w:rPr>
+              <w:t xml:space="preserve">관측 지표→녹/황/적, 격주 배치+War Room 신호등 — 완료판정: 황·적에 대응 문구</w:t>
+            </w:r>
+          </w:p>
+        </w:tc>
+      </w:tr>
+      <w:tr>
+        <w:tc>
+          <w:tcPr>
+            <w:tcW w:type="dxa" w:w="700"/>
+            <w:shd w:fill="FFFFFF" w:val="clear"/>
+            <w:tcMar>
+              <w:top w:type="dxa" w:w="80"/>
+              <w:left w:type="dxa" w:w="120"/>
+              <w:bottom w:type="dxa" w:w="80"/>
+              <w:right w:type="dxa" w:w="120"/>
+            </w:tcMar>
+            <w:vAlign w:val="center"/>
+          </w:tcPr>
+          <w:p>
+            <w:pPr>
+              <w:spacing w:line="300"/>
+              <w:jc w:val="left"/>
+            </w:pPr>
+            <w:r>
+              <w:rPr>
+                <w:rFonts w:ascii="Malgun Gothic" w:cs="Malgun Gothic" w:eastAsia="Malgun Gothic" w:hAnsi="Malgun Gothic"/>
+                <w:b/>
+                <w:bCs/>
+                <w:color w:val="6E3A1C"/>
+                <w:sz w:val="20"/>
+                <w:szCs w:val="20"/>
+              </w:rPr>
+              <w:t xml:space="preserve">E-8</w:t>
+            </w:r>
+          </w:p>
+        </w:tc>
+        <w:tc>
+          <w:tcPr>
+            <w:tcW w:type="dxa" w:w="3100"/>
+            <w:shd w:fill="FFFFFF" w:val="clear"/>
+            <w:tcMar>
+              <w:top w:type="dxa" w:w="80"/>
+              <w:left w:type="dxa" w:w="120"/>
+              <w:bottom w:type="dxa" w:w="80"/>
+              <w:right w:type="dxa" w:w="120"/>
+            </w:tcMar>
+            <w:vAlign w:val="center"/>
+          </w:tcPr>
+          <w:p>
+            <w:pPr>
+              <w:spacing w:line="300"/>
+              <w:jc w:val="left"/>
+            </w:pPr>
+            <w:r>
+              <w:rPr>
+                <w:rFonts w:ascii="Malgun Gothic" w:cs="Malgun Gothic" w:eastAsia="Malgun Gothic" w:hAnsi="Malgun Gothic"/>
+                <w:b w:val="false"/>
+                <w:bCs w:val="false"/>
+                <w:color w:val="2E241C"/>
+                <w:sz w:val="20"/>
+                <w:szCs w:val="20"/>
+              </w:rPr>
+              <w:t xml:space="preserve">지식센터 씨앗</w:t>
+            </w:r>
+          </w:p>
+        </w:tc>
+        <w:tc>
+          <w:tcPr>
+            <w:tcW w:type="dxa" w:w="5946"/>
+            <w:shd w:fill="FFFFFF" w:val="clear"/>
+            <w:tcMar>
+              <w:top w:type="dxa" w:w="80"/>
+              <w:left w:type="dxa" w:w="120"/>
+              <w:bottom w:type="dxa" w:w="80"/>
+              <w:right w:type="dxa" w:w="120"/>
+            </w:tcMar>
+            <w:vAlign w:val="center"/>
+          </w:tcPr>
+          <w:p>
+            <w:pPr>
+              <w:spacing w:line="300"/>
+              <w:jc w:val="left"/>
+            </w:pPr>
+            <w:r>
+              <w:rPr>
+                <w:rFonts w:ascii="Malgun Gothic" w:cs="Malgun Gothic" w:eastAsia="Malgun Gothic" w:hAnsi="Malgun Gothic"/>
+                <w:b w:val="false"/>
+                <w:bCs w:val="false"/>
+                <w:color w:val="2E241C"/>
+                <w:sz w:val="20"/>
+                <w:szCs w:val="20"/>
+              </w:rPr>
+              <w:t xml:space="preserve">메모 급증 키워드(기저 대비 lift 1.5+)→원인 후보, 메모 검색은 원장 참조 인용 — 완료판정: 무대조 쏠림 배제</w:t>
+            </w:r>
+          </w:p>
+        </w:tc>
+      </w:tr>
+      <w:tr>
+        <w:tc>
+          <w:tcPr>
+            <w:tcW w:type="dxa" w:w="700"/>
+            <w:shd w:fill="F8F2EA" w:val="clear"/>
+            <w:tcMar>
+              <w:top w:type="dxa" w:w="80"/>
+              <w:left w:type="dxa" w:w="120"/>
+              <w:bottom w:type="dxa" w:w="80"/>
+              <w:right w:type="dxa" w:w="120"/>
+            </w:tcMar>
+            <w:vAlign w:val="center"/>
+          </w:tcPr>
+          <w:p>
+            <w:pPr>
+              <w:spacing w:line="300"/>
+              <w:jc w:val="left"/>
+            </w:pPr>
+            <w:r>
+              <w:rPr>
+                <w:rFonts w:ascii="Malgun Gothic" w:cs="Malgun Gothic" w:eastAsia="Malgun Gothic" w:hAnsi="Malgun Gothic"/>
+                <w:b/>
+                <w:bCs/>
+                <w:color w:val="6E3A1C"/>
+                <w:sz w:val="20"/>
+                <w:szCs w:val="20"/>
+              </w:rPr>
+              <w:t xml:space="preserve">E-9</w:t>
+            </w:r>
+          </w:p>
+        </w:tc>
+        <w:tc>
+          <w:tcPr>
+            <w:tcW w:type="dxa" w:w="3100"/>
+            <w:shd w:fill="F8F2EA" w:val="clear"/>
+            <w:tcMar>
+              <w:top w:type="dxa" w:w="80"/>
+              <w:left w:type="dxa" w:w="120"/>
+              <w:bottom w:type="dxa" w:w="80"/>
+              <w:right w:type="dxa" w:w="120"/>
+            </w:tcMar>
+            <w:vAlign w:val="center"/>
+          </w:tcPr>
+          <w:p>
+            <w:pPr>
+              <w:spacing w:line="300"/>
+              <w:jc w:val="left"/>
+            </w:pPr>
+            <w:r>
+              <w:rPr>
+                <w:rFonts w:ascii="Malgun Gothic" w:cs="Malgun Gothic" w:eastAsia="Malgun Gothic" w:hAnsi="Malgun Gothic"/>
+                <w:b w:val="false"/>
+                <w:bCs w:val="false"/>
+                <w:color w:val="2E241C"/>
+                <w:sz w:val="20"/>
+                <w:szCs w:val="20"/>
+              </w:rPr>
+              <w:t xml:space="preserve">개방 포맷 내보내기</w:t>
+            </w:r>
+          </w:p>
+        </w:tc>
+        <w:tc>
+          <w:tcPr>
+            <w:tcW w:type="dxa" w:w="5946"/>
+            <w:shd w:fill="F8F2EA" w:val="clear"/>
+            <w:tcMar>
+              <w:top w:type="dxa" w:w="80"/>
+              <w:left w:type="dxa" w:w="120"/>
+              <w:bottom w:type="dxa" w:w="80"/>
+              <w:right w:type="dxa" w:w="120"/>
+            </w:tcMar>
+            <w:vAlign w:val="center"/>
+          </w:tcPr>
+          <w:p>
+            <w:pPr>
+              <w:spacing w:line="300"/>
+              <w:jc w:val="left"/>
+            </w:pPr>
+            <w:r>
+              <w:rPr>
+                <w:rFonts w:ascii="Malgun Gothic" w:cs="Malgun Gothic" w:eastAsia="Malgun Gothic" w:hAnsi="Malgun Gothic"/>
+                <w:b w:val="false"/>
+                <w:bCs w:val="false"/>
+                <w:color w:val="2E241C"/>
+                <w:sz w:val="20"/>
+                <w:szCs w:val="20"/>
+              </w:rPr>
+              <w:t xml:space="preserve">사실·차원 전체를 Parquet으로 매주 — 완료판정: 재판독 확인, 자산 대장 등록</w:t>
+            </w:r>
+          </w:p>
+        </w:tc>
+      </w:tr>
+      <w:tr>
+        <w:tc>
+          <w:tcPr>
+            <w:tcW w:type="dxa" w:w="700"/>
+            <w:shd w:fill="FFFFFF" w:val="clear"/>
+            <w:tcMar>
+              <w:top w:type="dxa" w:w="80"/>
+              <w:left w:type="dxa" w:w="120"/>
+              <w:bottom w:type="dxa" w:w="80"/>
+              <w:right w:type="dxa" w:w="120"/>
+            </w:tcMar>
+            <w:vAlign w:val="center"/>
+          </w:tcPr>
+          <w:p>
+            <w:pPr>
+              <w:spacing w:line="300"/>
+              <w:jc w:val="left"/>
+            </w:pPr>
+            <w:r>
+              <w:rPr>
+                <w:rFonts w:ascii="Malgun Gothic" w:cs="Malgun Gothic" w:eastAsia="Malgun Gothic" w:hAnsi="Malgun Gothic"/>
+                <w:b/>
+                <w:bCs/>
+                <w:color w:val="6E3A1C"/>
+                <w:sz w:val="20"/>
+                <w:szCs w:val="20"/>
+              </w:rPr>
+              <w:t xml:space="preserve">E-10</w:t>
+            </w:r>
+          </w:p>
+        </w:tc>
+        <w:tc>
+          <w:tcPr>
+            <w:tcW w:type="dxa" w:w="3100"/>
+            <w:shd w:fill="FFFFFF" w:val="clear"/>
+            <w:tcMar>
+              <w:top w:type="dxa" w:w="80"/>
+              <w:left w:type="dxa" w:w="120"/>
+              <w:bottom w:type="dxa" w:w="80"/>
+              <w:right w:type="dxa" w:w="120"/>
+            </w:tcMar>
+            <w:vAlign w:val="center"/>
+          </w:tcPr>
+          <w:p>
+            <w:pPr>
+              <w:spacing w:line="300"/>
+              <w:jc w:val="left"/>
+            </w:pPr>
+            <w:r>
+              <w:rPr>
+                <w:rFonts w:ascii="Malgun Gothic" w:cs="Malgun Gothic" w:eastAsia="Malgun Gothic" w:hAnsi="Malgun Gothic"/>
+                <w:b w:val="false"/>
+                <w:bCs w:val="false"/>
+                <w:color w:val="2E241C"/>
+                <w:sz w:val="20"/>
+                <w:szCs w:val="20"/>
+              </w:rPr>
+              <w:t xml:space="preserve">표준 코드 자동 매핑</w:t>
+            </w:r>
+          </w:p>
+        </w:tc>
+        <w:tc>
+          <w:tcPr>
+            <w:tcW w:type="dxa" w:w="5946"/>
+            <w:shd w:fill="FFFFFF" w:val="clear"/>
+            <w:tcMar>
+              <w:top w:type="dxa" w:w="80"/>
+              <w:left w:type="dxa" w:w="120"/>
+              <w:bottom w:type="dxa" w:w="80"/>
+              <w:right w:type="dxa" w:w="120"/>
+            </w:tcMar>
+            <w:vAlign w:val="center"/>
+          </w:tcPr>
+          <w:p>
+            <w:pPr>
+              <w:spacing w:line="300"/>
+              <w:jc w:val="left"/>
+            </w:pPr>
+            <w:r>
+              <w:rPr>
+                <w:rFonts w:ascii="Malgun Gothic" w:cs="Malgun Gothic" w:eastAsia="Malgun Gothic" w:hAnsi="Malgun Gothic"/>
+                <w:b w:val="false"/>
+                <w:bCs w:val="false"/>
+                <w:color w:val="2E241C"/>
+                <w:sz w:val="20"/>
+                <w:szCs w:val="20"/>
+              </w:rPr>
+              <w:t xml:space="preserve">별칭이 표준 코드와 완전 일치하면 auto 확정자로 자기 매핑 — 완료판정: 격리 큐에 완전 일치 별칭 0건</w:t>
+            </w:r>
+          </w:p>
+        </w:tc>
+      </w:tr>
+    </w:tbl>
+    <w:p>
+      <w:pPr>
+        <w:spacing w:after="100"/>
+      </w:pPr>
+    </w:p>
+    <w:p>
+      <w:pPr>
+        <w:spacing w:after="160" w:line="340"/>
+      </w:pPr>
+      <w:r>
+        <w:rPr>
+          <w:rFonts w:ascii="Malgun Gothic" w:cs="Malgun Gothic" w:eastAsia="Malgun Gothic" w:hAnsi="Malgun Gothic"/>
+          <w:i/>
+          <w:iCs/>
+          <w:color w:val="76675A"/>
+          <w:sz w:val="22"/>
+          <w:szCs w:val="22"/>
+        </w:rPr>
+        <w:t xml:space="preserve">구축 중 잡은 함정 셋도 프롬프트의 금지 조항 후보다 — ① 이상탐지 정상 구간에 정비 이력 제외를 강제하라 ② 확신도 수용은 관측 창 시간순으로 처리하라 ③ 환각 차단기에 백분율 표기 변환을 허용 목록으로 명시하라. (상세: ax-platform/ISSUES.md I-01·I-11·I-03)</w:t>
+      </w:r>
     </w:p>
     <w:p>
       <w:pPr>

</xml_diff>